<commit_message>
feat: professional tool report in English (canonical) + AR reference copy
</commit_message>
<xml_diff>
--- a/StegoNexus_Professional_Report.docx
+++ b/StegoNexus_Professional_Report.docx
@@ -9,7 +9,7 @@
       <w:r>
         <w:drawing>
           <wp:inline xmlns:a="http://schemas.openxmlformats.org/drawingml/2006/main" xmlns:pic="http://schemas.openxmlformats.org/drawingml/2006/picture">
-            <wp:extent cx="2926080" cy="1596044"/>
+            <wp:extent cx="2651760" cy="1446415"/>
             <wp:docPr id="1" name="Picture 1"/>
             <wp:cNvGraphicFramePr>
               <a:graphicFrameLocks noChangeAspect="1"/>
@@ -30,7 +30,7 @@
                   <pic:spPr>
                     <a:xfrm>
                       <a:off x="0" y="0"/>
-                      <a:ext cx="2926080" cy="1596044"/>
+                      <a:ext cx="2651760" cy="1446415"/>
                     </a:xfrm>
                     <a:prstGeom prst="rect"/>
                   </pic:spPr>
@@ -54,7 +54,7 @@
           <w:b/>
           <w:i w:val="0"/>
           <w:color w:val="008050"/>
-          <w:sz w:val="72"/>
+          <w:sz w:val="76"/>
         </w:rPr>
         <w:t>StegoNexus</w:t>
       </w:r>
@@ -89,9 +89,10 @@
           <w:color w:val="1A1A1A"/>
           <w:sz w:val="48"/>
         </w:rPr>
-        <w:t>التقرير الاحترافي للأداة</w:t>
+        <w:t>PROFESSIONAL TOOL REPORT</w:t>
       </w:r>
     </w:p>
+    <w:p/>
     <w:p>
       <w:pPr>
         <w:spacing w:after="120"/>
@@ -103,9 +104,9 @@
           <w:b/>
           <w:i w:val="0"/>
           <w:color w:val="1A1A1A"/>
-          <w:sz w:val="26"/>
+          <w:sz w:val="28"/>
         </w:rPr>
-        <w:t>إعداد وتطوير: Mohammed Moneer Al-absi</w:t>
+        <w:t>Prepared &amp; developed by:  Mohammed Moneer Al-absi</w:t>
       </w:r>
     </w:p>
     <w:p>
@@ -121,7 +122,7 @@
           <w:color w:val="606060"/>
           <w:sz w:val="24"/>
         </w:rPr>
-        <w:t>الإصدار: v1.0.0   |   تاريخ الإصدار: 2026-09-08   |   حجم الكود: ≈ 6,236 سطر Python</w:t>
+        <w:t>Version: v1.0.0   |   Date: 08 September 2026   |   Codebase: ≈ 6,236 lines of Python</w:t>
       </w:r>
     </w:p>
     <w:p>
@@ -137,7 +138,7 @@
           <w:color w:val="606060"/>
           <w:sz w:val="24"/>
         </w:rPr>
-        <w:t>منصة التشغيل: Kali Linux  (Python 3 + PySide6)</w:t>
+        <w:t>Platform: Kali Linux  (Python 3.10+ · PySide6)</w:t>
       </w:r>
     </w:p>
     <w:p>
@@ -158,7 +159,7 @@
           <w:color w:val="008050"/>
           <w:sz w:val="36"/>
         </w:rPr>
-        <w:t>المحتويات</w:t>
+        <w:t>Table of Contents</w:t>
       </w:r>
     </w:p>
     <w:p>
@@ -173,7 +174,7 @@
           <w:color w:val="1A1A1A"/>
           <w:sz w:val="24"/>
         </w:rPr>
-        <w:t>1. الملخص التنفيذي</w:t>
+        <w:t>1. Executive Summary</w:t>
       </w:r>
     </w:p>
     <w:p>
@@ -188,7 +189,7 @@
           <w:color w:val="1A1A1A"/>
           <w:sz w:val="24"/>
         </w:rPr>
-        <w:t>2. الأداة في لمحة (البيانات الأساسية)</w:t>
+        <w:t>2. The Tool at a Glance</w:t>
       </w:r>
     </w:p>
     <w:p>
@@ -203,7 +204,7 @@
           <w:color w:val="1A1A1A"/>
           <w:sz w:val="24"/>
         </w:rPr>
-        <w:t>3. تغطية متطلبات مشروع الترم (12 قسماً)</w:t>
+        <w:t>3. Coverage of the Term Requirements (12 sections)</w:t>
       </w:r>
     </w:p>
     <w:p>
@@ -218,7 +219,7 @@
           <w:color w:val="1A1A1A"/>
           <w:sz w:val="24"/>
         </w:rPr>
-        <w:t>4. القدرات والوحدات (Hiding · Extraction · Analysis)</w:t>
+        <w:t>4. Capabilities &amp; Modules (Hiding · Extraction · Analysis)</w:t>
       </w:r>
     </w:p>
     <w:p>
@@ -233,7 +234,7 @@
           <w:color w:val="1A1A1A"/>
           <w:sz w:val="24"/>
         </w:rPr>
-        <w:t>5. التقنيات المنفّذة — أكثر من تقنية لكل موضوع</w:t>
+        <w:t>5. Implemented Techniques — More than One Per Topic</w:t>
       </w:r>
     </w:p>
     <w:p>
@@ -248,7 +249,7 @@
           <w:color w:val="1A1A1A"/>
           <w:sz w:val="24"/>
         </w:rPr>
-        <w:t>6. البنية المعمارية وهيكل المشروع</w:t>
+        <w:t>6. Architecture &amp; Project Structure</w:t>
       </w:r>
     </w:p>
     <w:p>
@@ -263,7 +264,7 @@
           <w:color w:val="1A1A1A"/>
           <w:sz w:val="24"/>
         </w:rPr>
-        <w:t>7. الاختبار والتحقق من الجودة</w:t>
+        <w:t>7. Testing &amp; Quality Verification</w:t>
       </w:r>
     </w:p>
     <w:p>
@@ -278,7 +279,7 @@
           <w:color w:val="1A1A1A"/>
           <w:sz w:val="24"/>
         </w:rPr>
-        <w:t>8. نسبة المطابقة مع ملف المتطلبات</w:t>
+        <w:t>8. Compliance with the Project Specification</w:t>
       </w:r>
     </w:p>
     <w:p>
@@ -293,7 +294,7 @@
           <w:color w:val="1A1A1A"/>
           <w:sz w:val="24"/>
         </w:rPr>
-        <w:t>9. معرض لقطات الواجهة (GUI)</w:t>
+        <w:t>9. GUI Screenshots Gallery</w:t>
       </w:r>
     </w:p>
     <w:p>
@@ -308,7 +309,7 @@
           <w:color w:val="1A1A1A"/>
           <w:sz w:val="24"/>
         </w:rPr>
-        <w:t>10. أمثلة الاستخدام (GUI و CLI)</w:t>
+        <w:t>10. Usage Examples (GUI &amp; CLI)</w:t>
       </w:r>
     </w:p>
     <w:p>
@@ -323,7 +324,7 @@
           <w:color w:val="1A1A1A"/>
           <w:sz w:val="24"/>
         </w:rPr>
-        <w:t>11. الحماية والأخلاقيات المدمجة</w:t>
+        <w:t>11. Built-in Security &amp; Ethics</w:t>
       </w:r>
     </w:p>
     <w:p>
@@ -338,7 +339,7 @@
           <w:color w:val="1A1A1A"/>
           <w:sz w:val="24"/>
         </w:rPr>
-        <w:t>12. مخرجات المشروع والتسليمات</w:t>
+        <w:t>12. Project Deliverables</w:t>
       </w:r>
     </w:p>
     <w:p>
@@ -353,7 +354,7 @@
           <w:color w:val="1A1A1A"/>
           <w:sz w:val="24"/>
         </w:rPr>
-        <w:t>13. الخلاصة</w:t>
+        <w:t>13. Conclusion</w:t>
       </w:r>
     </w:p>
     <w:p>
@@ -374,7 +375,7 @@
           <w:color w:val="008050"/>
           <w:sz w:val="36"/>
         </w:rPr>
-        <w:t>1) الملخص التنفيذي</w:t>
+        <w:t>1) Executive Summary</w:t>
       </w:r>
     </w:p>
     <w:p>
@@ -389,7 +390,7 @@
           <w:color w:val="1A1A1A"/>
           <w:sz w:val="22"/>
         </w:rPr>
-        <w:t>أداة StegoNexus هي إطار عمل متكامل (Framework) يحوّل تقنيات الإخفاء (Hiding) والاستخراج (Extraction) التي تم تناولها خلال الترم إلى أداة واحدة تعمل على Kali Linux، بدلاً من استخدام برنامج جاهز لكل تقنية. تجمع الأداة:</w:t>
+        <w:t>StegoNexus is a unified framework that converts the Hiding &amp; Extraction techniques covered during the term into a single integrated tool running on Kali Linux — instead of relying on a separate ready-made program for each technique. The tool provides:</w:t>
       </w:r>
     </w:p>
     <w:p>
@@ -405,7 +406,7 @@
           <w:color w:val="1A1A1A"/>
           <w:sz w:val="22"/>
         </w:rPr>
-        <w:t>• إخفاء واستخراج البيانات في: النصوص، الصور، الصوت، الفيديو، الشبكة — بأكثر من تقنية لكل موضوع.</w:t>
+        <w:t>• Data hiding and extraction in: text, images, audio, video and network — with more than one technique per topic.</w:t>
       </w:r>
     </w:p>
     <w:p>
@@ -421,7 +422,7 @@
           <w:color w:val="1A1A1A"/>
           <w:sz w:val="22"/>
         </w:rPr>
-        <w:t>• قسم تحليل جنائي (Forensics &amp; Analysis) يدمج 8 أدوات في تقرير واحد مع نتائج موحّدة.</w:t>
+        <w:t>• A complete Forensics &amp; Analysis section that merges 8 tools into one consolidated report.</w:t>
       </w:r>
     </w:p>
     <w:p>
@@ -437,7 +438,7 @@
           <w:color w:val="1A1A1A"/>
           <w:sz w:val="22"/>
         </w:rPr>
-        <w:t>• قسم هاش (Hashing &amp; Integrity) بأربع خوارزميات لإثبات سلامة الملفات.</w:t>
+        <w:t>• A Hashing &amp; Integrity section with four algorithms to prove file integrity.</w:t>
       </w:r>
     </w:p>
     <w:p>
@@ -453,7 +454,7 @@
           <w:color w:val="1A1A1A"/>
           <w:sz w:val="22"/>
         </w:rPr>
-        <w:t>• إدارة قضايا شاملة: Case + Reports (MD/JSON/HTML) + سجل تحقيقات زمني.</w:t>
+        <w:t>• Full Case Management: Case files + Reports (MD/JSON/HTML) + a chronological investigation log.</w:t>
       </w:r>
     </w:p>
     <w:p>
@@ -469,7 +470,7 @@
           <w:color w:val="1A1A1A"/>
           <w:sz w:val="22"/>
         </w:rPr>
-        <w:t>• واجهتان متكاملتان: Dashboard رسومية (PySide6) وواجهة أوامر CLI (22 أمراً).</w:t>
+        <w:t>• Two integrated interfaces: a graphical Dashboard (PySide6) and a 22-command CLI.</w:t>
       </w:r>
     </w:p>
     <w:p>
@@ -484,7 +485,7 @@
           <w:color w:val="1A1A1A"/>
           <w:sz w:val="22"/>
         </w:rPr>
-        <w:t>الأداة مبنية بـ Python 3 (≈ 6,236 سطراً) ولا تتوقف عن العمل أبداً: كل أداة من أدوات Kali مستدعاة تلقائياً، ومتى غابت تنتقل الأداة فوراً إلى بديل مدمج بالكامل. اجتازت الأداة 60/60 فحص متطلبات حي و24/24 اختبار تكامل.</w:t>
+        <w:t>The tool is built in Python 3 (≈ 6,236 lines) and never stops working: every Kali tool is invoked automatically when present, and the moment it is missing the tool instantly falls back to a fully built-in pure-Python implementation. StegoNexus passed 60/60 live requirement checks and 24/24 end-to-end integration tests.</w:t>
       </w:r>
     </w:p>
     <w:p>
@@ -500,7 +501,7 @@
           <w:color w:val="008050"/>
           <w:sz w:val="36"/>
         </w:rPr>
-        <w:t>2) الأداة في لمحة</w:t>
+        <w:t>2) The Tool at a Glance</w:t>
       </w:r>
     </w:p>
     <w:tbl>
@@ -529,7 +530,7 @@
                 <w:color w:val="008050"/>
                 <w:sz w:val="20"/>
               </w:rPr>
-              <w:t>البند</w:t>
+              <w:t>Item</w:t>
             </w:r>
           </w:p>
         </w:tc>
@@ -547,7 +548,7 @@
                 <w:color w:val="008050"/>
                 <w:sz w:val="20"/>
               </w:rPr>
-              <w:t>التفاصيل</w:t>
+              <w:t>Details</w:t>
             </w:r>
           </w:p>
         </w:tc>
@@ -567,7 +568,7 @@
                 <w:color w:val="1A1A1A"/>
                 <w:sz w:val="20"/>
               </w:rPr>
-              <w:t>الاسم</w:t>
+              <w:t>Name</w:t>
             </w:r>
           </w:p>
         </w:tc>
@@ -605,7 +606,7 @@
                 <w:color w:val="1A1A1A"/>
                 <w:sz w:val="20"/>
               </w:rPr>
-              <w:t>المطوّر</w:t>
+              <w:t>Developer</w:t>
             </w:r>
           </w:p>
         </w:tc>
@@ -643,7 +644,7 @@
                 <w:color w:val="1A1A1A"/>
                 <w:sz w:val="20"/>
               </w:rPr>
-              <w:t>الغرض</w:t>
+              <w:t>Purpose</w:t>
             </w:r>
           </w:p>
         </w:tc>
@@ -661,7 +662,7 @@
                 <w:color w:val="1A1A1A"/>
                 <w:sz w:val="20"/>
               </w:rPr>
-              <w:t>تطبيق عملي موحّد لكل تقنيات الإخفاء والاستخراج المدروسة + التحليل الجنائي</w:t>
+              <w:t>One practical application of every hiding/extraction technique studied, plus digital forensics</w:t>
             </w:r>
           </w:p>
         </w:tc>
@@ -681,7 +682,7 @@
                 <w:color w:val="1A1A1A"/>
                 <w:sz w:val="20"/>
               </w:rPr>
-              <w:t>المنصة</w:t>
+              <w:t>Platform</w:t>
             </w:r>
           </w:p>
         </w:tc>
@@ -699,7 +700,7 @@
                 <w:color w:val="1A1A1A"/>
                 <w:sz w:val="20"/>
               </w:rPr>
-              <w:t>Kali Linux (تعمل على أي Linux حديث) — Python 3.10+، PySide6</w:t>
+              <w:t>Kali Linux (any modern Linux) — Python 3.10+, PySide6</w:t>
             </w:r>
           </w:p>
         </w:tc>
@@ -719,7 +720,7 @@
                 <w:color w:val="1A1A1A"/>
                 <w:sz w:val="20"/>
               </w:rPr>
-              <w:t>الواجهات</w:t>
+              <w:t>Interfaces</w:t>
             </w:r>
           </w:p>
         </w:tc>
@@ -737,7 +738,7 @@
                 <w:color w:val="1A1A1A"/>
                 <w:sz w:val="20"/>
               </w:rPr>
-              <w:t>GUI (Dashboard من 10 صفحات) + CLI (22 أمراً) + سكريبت videohide.sh</w:t>
+              <w:t>GUI (10-page Dashboard) + CLI (22 commands) + videohide.sh helper script</w:t>
             </w:r>
           </w:p>
         </w:tc>
@@ -757,7 +758,7 @@
                 <w:color w:val="1A1A1A"/>
                 <w:sz w:val="20"/>
               </w:rPr>
-              <w:t>الاعتماد على أدوات خارجية</w:t>
+              <w:t>External tools</w:t>
             </w:r>
           </w:p>
         </w:tc>
@@ -775,7 +776,7 @@
                 <w:color w:val="1A1A1A"/>
                 <w:sz w:val="20"/>
               </w:rPr>
-              <w:t>اختياري بالكامل: steghide · exiftool · binwalk · foremost · zsteg · ffmpeg/ffprobe مع بدائل مدمجة</w:t>
+              <w:t>Fully optional: steghide · exiftool · binwalk · foremost · zsteg · ffmpeg/ffprobe — each with a built-in fallback</w:t>
             </w:r>
           </w:p>
         </w:tc>
@@ -795,7 +796,7 @@
                 <w:color w:val="1A1A1A"/>
                 <w:sz w:val="20"/>
               </w:rPr>
-              <w:t>التقنيات المدعومة</w:t>
+              <w:t>Supported topics</w:t>
             </w:r>
           </w:p>
         </w:tc>
@@ -813,7 +814,7 @@
                 <w:color w:val="1A1A1A"/>
                 <w:sz w:val="20"/>
               </w:rPr>
-              <w:t>نص (2) · صورة (2) · صوت (4) · فيديو (3) · شبكة (3) · برامج ضارة (تحليل وكشف)</w:t>
+              <w:t>Text (2) · Image (2) · Audio (4) · Video (3) · Network (3) · Malware (analysis &amp; detection)</w:t>
             </w:r>
           </w:p>
         </w:tc>
@@ -833,7 +834,7 @@
                 <w:color w:val="1A1A1A"/>
                 <w:sz w:val="20"/>
               </w:rPr>
-              <w:t>حجم الكود</w:t>
+              <w:t>Codebase size</w:t>
             </w:r>
           </w:p>
         </w:tc>
@@ -851,7 +852,7 @@
                 <w:color w:val="1A1A1A"/>
                 <w:sz w:val="20"/>
               </w:rPr>
-              <w:t>≈ 6,236 سطر Python (الأداة + الاختبارات)</w:t>
+              <w:t>≈ 6,236 lines of Python (tool + tests)</w:t>
             </w:r>
           </w:p>
         </w:tc>
@@ -871,7 +872,7 @@
                 <w:color w:val="1A1A1A"/>
                 <w:sz w:val="20"/>
               </w:rPr>
-              <w:t>حالة الجودة</w:t>
+              <w:t>Quality status</w:t>
             </w:r>
           </w:p>
         </w:tc>
@@ -889,7 +890,7 @@
                 <w:color w:val="1A1A1A"/>
                 <w:sz w:val="20"/>
               </w:rPr>
-              <w:t>مكتملة وموثّقة ومُختبَرة (60/60 + 24/24)</w:t>
+              <w:t>Complete, documented and tested (60/60 + 24/24)</w:t>
             </w:r>
           </w:p>
         </w:tc>
@@ -909,7 +910,7 @@
           <w:color w:val="008050"/>
           <w:sz w:val="36"/>
         </w:rPr>
-        <w:t>3) تغطية متطلبات مشروع الترم (12 قسماً)</w:t>
+        <w:t>3) Coverage of the Term Requirements (12 sections)</w:t>
       </w:r>
     </w:p>
     <w:tbl>
@@ -939,7 +940,7 @@
                 <w:color w:val="008050"/>
                 <w:sz w:val="20"/>
               </w:rPr>
-              <w:t>القسم</w:t>
+              <w:t>Sec.</w:t>
             </w:r>
           </w:p>
         </w:tc>
@@ -957,7 +958,7 @@
                 <w:color w:val="008050"/>
                 <w:sz w:val="20"/>
               </w:rPr>
-              <w:t>المتطلبات</w:t>
+              <w:t>Requirements</w:t>
             </w:r>
           </w:p>
         </w:tc>
@@ -975,7 +976,7 @@
                 <w:color w:val="008050"/>
                 <w:sz w:val="20"/>
               </w:rPr>
-              <w:t>الحالة</w:t>
+              <w:t>Status</w:t>
             </w:r>
           </w:p>
         </w:tc>
@@ -1013,7 +1014,7 @@
                 <w:color w:val="1A1A1A"/>
                 <w:sz w:val="20"/>
               </w:rPr>
-              <w:t>الفكرة العامة + Forensics/Analysis (file, strings, exiftool, binwalk, steghide info, foremost, zsteg, Shannon Entropy, Aggregated + Case/Reports/Logs)</w:t>
+              <w:t>General idea + Forensics/Analysis (file, strings, exiftool, binwalk, steghide info, foremost, zsteg, Shannon Entropy, aggregated output + Case/Reports/Logs)</w:t>
             </w:r>
           </w:p>
         </w:tc>
@@ -1031,7 +1032,7 @@
                 <w:color w:val="1A1A1A"/>
                 <w:sz w:val="20"/>
               </w:rPr>
-              <w:t>اكتمل 100%</w:t>
+              <w:t>100% complete</w:t>
             </w:r>
           </w:p>
         </w:tc>
@@ -1087,7 +1088,7 @@
                 <w:color w:val="1A1A1A"/>
                 <w:sz w:val="20"/>
               </w:rPr>
-              <w:t>اكتمل 100%</w:t>
+              <w:t>100% complete</w:t>
             </w:r>
           </w:p>
         </w:tc>
@@ -1143,7 +1144,7 @@
                 <w:color w:val="1A1A1A"/>
                 <w:sz w:val="20"/>
               </w:rPr>
-              <w:t>اكتمل 100% (+ تقنية ثانية)</w:t>
+              <w:t>100% complete (+ 2nd technique)</w:t>
             </w:r>
           </w:p>
         </w:tc>
@@ -1199,7 +1200,7 @@
                 <w:color w:val="1A1A1A"/>
                 <w:sz w:val="20"/>
               </w:rPr>
-              <w:t>اكتمل 100%</w:t>
+              <w:t>100% complete</w:t>
             </w:r>
           </w:p>
         </w:tc>
@@ -1237,7 +1238,7 @@
                 <w:color w:val="1A1A1A"/>
                 <w:sz w:val="20"/>
               </w:rPr>
-              <w:t>Audio (LSB, Phase, Spread Spectrum, Metadata, Spectrogram/Waveform)</w:t>
+              <w:t>Audio (LSB, Phase Coding, Spread Spectrum, Metadata, Spectrogram/Waveform)</w:t>
             </w:r>
           </w:p>
         </w:tc>
@@ -1255,7 +1256,7 @@
                 <w:color w:val="1A1A1A"/>
                 <w:sz w:val="20"/>
               </w:rPr>
-              <w:t>اكتمل 100%</w:t>
+              <w:t>100% complete</w:t>
             </w:r>
           </w:p>
         </w:tc>
@@ -1311,7 +1312,7 @@
                 <w:color w:val="1A1A1A"/>
                 <w:sz w:val="20"/>
               </w:rPr>
-              <w:t>اكتمل 100%</w:t>
+              <w:t>100% complete</w:t>
             </w:r>
           </w:p>
         </w:tc>
@@ -1349,7 +1350,7 @@
                 <w:color w:val="1A1A1A"/>
                 <w:sz w:val="20"/>
               </w:rPr>
-              <w:t>Network Covert Communication (IP-ID / ISN / Timing + كشف)</w:t>
+              <w:t>Network Covert Communication (IP-ID / ISN / Timing + detection)</w:t>
             </w:r>
           </w:p>
         </w:tc>
@@ -1367,7 +1368,7 @@
                 <w:color w:val="1A1A1A"/>
                 <w:sz w:val="20"/>
               </w:rPr>
-              <w:t>اكتمل 100%</w:t>
+              <w:t>100% complete</w:t>
             </w:r>
           </w:p>
         </w:tc>
@@ -1423,7 +1424,7 @@
                 <w:color w:val="1A1A1A"/>
                 <w:sz w:val="20"/>
               </w:rPr>
-              <w:t>اكتمل 100% (دفاعي)</w:t>
+              <w:t>100% complete (defensive)</w:t>
             </w:r>
           </w:p>
         </w:tc>
@@ -1461,7 +1462,7 @@
                 <w:color w:val="1A1A1A"/>
                 <w:sz w:val="20"/>
               </w:rPr>
-              <w:t>Python + PySide6 GUI + Case Management + Reports + Logs + الخلاصة</w:t>
+              <w:t>Python + PySide6 GUI + Case Management + Reports + Logs + Conclusion</w:t>
             </w:r>
           </w:p>
         </w:tc>
@@ -1479,7 +1480,7 @@
                 <w:color w:val="1A1A1A"/>
                 <w:sz w:val="20"/>
               </w:rPr>
-              <w:t>اكتمل 100%</w:t>
+              <w:t>100% complete</w:t>
             </w:r>
           </w:p>
         </w:tc>
@@ -1499,7 +1500,7 @@
           <w:color w:val="008050"/>
           <w:sz w:val="36"/>
         </w:rPr>
-        <w:t>4) القدرات والوحدات (Hiding · Extraction · Analysis)</w:t>
+        <w:t>4) Capabilities &amp; Modules (Hiding · Extraction · Analysis)</w:t>
       </w:r>
     </w:p>
     <w:tbl>
@@ -1529,7 +1530,7 @@
                 <w:color w:val="008050"/>
                 <w:sz w:val="20"/>
               </w:rPr>
-              <w:t>الوحدة</w:t>
+              <w:t>Module</w:t>
             </w:r>
           </w:p>
         </w:tc>
@@ -1585,7 +1586,7 @@
                 <w:color w:val="1A1A1A"/>
                 <w:sz w:val="20"/>
               </w:rPr>
-              <w:t>Text (تقنيتان)</w:t>
+              <w:t>Text (2 techniques)</w:t>
             </w:r>
           </w:p>
         </w:tc>
@@ -1621,7 +1622,7 @@
                 <w:color w:val="1A1A1A"/>
                 <w:sz w:val="20"/>
               </w:rPr>
-              <w:t>الاستخراج بالمفتاح · text-inspect يكشف Zero-Width بدون مفتاح</w:t>
+              <w:t>Key-based extraction · text-inspect detects Zero-Width without the key</w:t>
             </w:r>
           </w:p>
         </w:tc>
@@ -1677,7 +1678,7 @@
                 <w:color w:val="1A1A1A"/>
                 <w:sz w:val="20"/>
               </w:rPr>
-              <w:t>Steghide extract · CyberHide extract (HMAC يرفض المفتاح الخاطئ) · Probe/zsteg</w:t>
+              <w:t>Steghide extract · CyberHide extract (HMAC rejects wrong password) · Probe/zsteg</w:t>
             </w:r>
           </w:p>
         </w:tc>
@@ -1697,7 +1698,7 @@
                 <w:color w:val="1A1A1A"/>
                 <w:sz w:val="20"/>
               </w:rPr>
-              <w:t>Audio (4 تقنيات)</w:t>
+              <w:t>Audio (4 techniques)</w:t>
             </w:r>
           </w:p>
         </w:tc>
@@ -1733,7 +1734,7 @@
                 <w:color w:val="1A1A1A"/>
                 <w:sz w:val="20"/>
               </w:rPr>
-              <w:t>استخراج بنفس التقنية والمفتاح · تحليل طيفي/موجي</w:t>
+              <w:t>Extraction with the same technique+key · spectrum/waveform analysis</w:t>
             </w:r>
           </w:p>
         </w:tc>
@@ -1753,7 +1754,7 @@
                 <w:color w:val="1A1A1A"/>
                 <w:sz w:val="20"/>
               </w:rPr>
-              <w:t>Video (3 تقنيات)</w:t>
+              <w:t>Video (3 techniques)</w:t>
             </w:r>
           </w:p>
         </w:tc>
@@ -1789,7 +1790,7 @@
                 <w:color w:val="1A1A1A"/>
                 <w:sz w:val="20"/>
               </w:rPr>
-              <w:t>استخراج + ffprobe/ffmpeg</w:t>
+              <w:t>Extraction + ffprobe/ffmpeg verification</w:t>
             </w:r>
           </w:p>
         </w:tc>
@@ -1809,7 +1810,7 @@
                 <w:color w:val="1A1A1A"/>
                 <w:sz w:val="20"/>
               </w:rPr>
-              <w:t>Network (3 قنوات)</w:t>
+              <w:t>Network (3 channels)</w:t>
             </w:r>
           </w:p>
         </w:tc>
@@ -1845,7 +1846,7 @@
                 <w:color w:val="1A1A1A"/>
                 <w:sz w:val="20"/>
               </w:rPr>
-              <w:t>إعادة تجميع بالمفتاح + كشف القناة الخفية</w:t>
+              <w:t>Key-based reassembly + covert-channel detector</w:t>
             </w:r>
           </w:p>
         </w:tc>
@@ -1883,7 +1884,7 @@
                 <w:color w:val="1A1A1A"/>
                 <w:sz w:val="20"/>
               </w:rPr>
-              <w:t>نماذج تعليمية خاملة فقط (لا أدوات ضارة)</w:t>
+              <w:t>Inert educational stubs only (no weaponization)</w:t>
             </w:r>
           </w:p>
         </w:tc>
@@ -1901,7 +1902,7 @@
                 <w:color w:val="1A1A1A"/>
                 <w:sz w:val="20"/>
               </w:rPr>
-              <w:t>تحليل PE/ELF + إنتروبيا الأقسام + بصمات PyInstaller/WinRAR/Sliver/Metasploit</w:t>
+              <w:t>PE/ELF analysis + section entropy + PyInstaller/WinRAR/Sliver/Metasploit fingerprints</w:t>
             </w:r>
           </w:p>
         </w:tc>
@@ -1957,7 +1958,7 @@
                 <w:color w:val="1A1A1A"/>
                 <w:sz w:val="20"/>
               </w:rPr>
-              <w:t>8 أدوات في تقرير موحّد + Verdict</w:t>
+              <w:t>8 tools in one report + verdict</w:t>
             </w:r>
           </w:p>
         </w:tc>
@@ -2013,7 +2014,7 @@
                 <w:color w:val="1A1A1A"/>
                 <w:sz w:val="20"/>
               </w:rPr>
-              <w:t>MD5/SHA-1/SHA-256/SHA-512 + manifests + مقارنة</w:t>
+              <w:t>MD5/SHA-1/SHA-256/SHA-512 + manifests + file comparison</w:t>
             </w:r>
           </w:p>
         </w:tc>
@@ -2051,7 +2052,7 @@
                 <w:color w:val="1A1A1A"/>
                 <w:sz w:val="20"/>
               </w:rPr>
-              <w:t>حقن Comment/Author (exiftool/Pillow) + صوتي ICMT</w:t>
+              <w:t>Inject Comment/Author (exiftool/Pillow) + audio ICMT</w:t>
             </w:r>
           </w:p>
         </w:tc>
@@ -2069,7 +2070,7 @@
                 <w:color w:val="1A1A1A"/>
                 <w:sz w:val="20"/>
               </w:rPr>
-              <w:t>عرض كل الحقول مع بديل مدمج</w:t>
+              <w:t>View all fields (with built-in fallback)</w:t>
             </w:r>
           </w:p>
         </w:tc>
@@ -2107,7 +2108,7 @@
                 <w:color w:val="1A1A1A"/>
                 <w:sz w:val="20"/>
               </w:rPr>
-              <w:t>إنشاء/فتح/إغلاق قضية + ربط كل عملية</w:t>
+              <w:t>Create/open/close case + attach every action</w:t>
             </w:r>
           </w:p>
         </w:tc>
@@ -2125,7 +2126,7 @@
                 <w:color w:val="1A1A1A"/>
                 <w:sz w:val="20"/>
               </w:rPr>
-              <w:t>تقارير MD/JSON/HTML + سجل investigation.log</w:t>
+              <w:t>Reports MD/JSON/HTML + investigation.log</w:t>
             </w:r>
           </w:p>
         </w:tc>
@@ -2145,7 +2146,7 @@
           <w:color w:val="008050"/>
           <w:sz w:val="36"/>
         </w:rPr>
-        <w:t>5) التقنيات المنفّذة — أكثر من تقنية لكل موضوع</w:t>
+        <w:t>5) Implemented Techniques — More than One Per Topic</w:t>
       </w:r>
     </w:p>
     <w:p>
@@ -2160,7 +2161,7 @@
           <w:color w:val="1A1A1A"/>
           <w:sz w:val="22"/>
         </w:rPr>
-        <w:t>حسب متطلب «كل موضوع إخفاء يمكن تطبيقه بأكثر من تقنية»، نفّذت الأداة:</w:t>
+        <w:t>Per the requirement “each hiding topic can be implemented with more than one technique”, the tool implements:</w:t>
       </w:r>
     </w:p>
     <w:tbl>
@@ -2190,7 +2191,7 @@
                 <w:color w:val="008050"/>
                 <w:sz w:val="20"/>
               </w:rPr>
-              <w:t>الموضوع</w:t>
+              <w:t>Topic</w:t>
             </w:r>
           </w:p>
         </w:tc>
@@ -2208,7 +2209,7 @@
                 <w:color w:val="008050"/>
                 <w:sz w:val="20"/>
               </w:rPr>
-              <w:t>التقنيات</w:t>
+              <w:t>Techniques</w:t>
             </w:r>
           </w:p>
         </w:tc>
@@ -2226,7 +2227,7 @@
                 <w:color w:val="008050"/>
                 <w:sz w:val="20"/>
               </w:rPr>
-              <w:t>الاستخدام الأمثل</w:t>
+              <w:t>Best use</w:t>
             </w:r>
           </w:p>
         </w:tc>
@@ -2246,7 +2247,7 @@
                 <w:color w:val="1A1A1A"/>
                 <w:sz w:val="20"/>
               </w:rPr>
-              <w:t>النصوص</w:t>
+              <w:t>Text</w:t>
             </w:r>
           </w:p>
         </w:tc>
@@ -2264,7 +2265,7 @@
                 <w:color w:val="1A1A1A"/>
                 <w:sz w:val="20"/>
               </w:rPr>
-              <w:t>1) LSB مع مفتاح   2) أحرف Zero-Width غير مرئية</w:t>
+              <w:t>1) LSB with Key   2) Zero-Width invisible characters</w:t>
             </w:r>
           </w:p>
         </w:tc>
@@ -2282,7 +2283,7 @@
                 <w:color w:val="1A1A1A"/>
                 <w:sz w:val="20"/>
               </w:rPr>
-              <w:t>1) نص قابل للطباعة  2) نص بسيط لا يُغيّر شكله إطلاقاً</w:t>
+              <w:t>1) printable text   2) unchanged-looking text</w:t>
             </w:r>
           </w:p>
         </w:tc>
@@ -2302,7 +2303,7 @@
                 <w:color w:val="1A1A1A"/>
                 <w:sz w:val="20"/>
               </w:rPr>
-              <w:t>الصور</w:t>
+              <w:t>Images</w:t>
             </w:r>
           </w:p>
         </w:tc>
@@ -2320,7 +2321,7 @@
                 <w:color w:val="1A1A1A"/>
                 <w:sz w:val="20"/>
               </w:rPr>
-              <w:t>1) Steghide (Kali)   2) CyberHide (AES-LSB خالص Python)</w:t>
+              <w:t>1) Steghide (Kali)   2) CyberHide (pure-Python AES-LSB)</w:t>
             </w:r>
           </w:p>
         </w:tc>
@@ -2338,7 +2339,7 @@
                 <w:color w:val="1A1A1A"/>
                 <w:sz w:val="20"/>
               </w:rPr>
-              <w:t>1) JPEG/BMP   2) PNG بدون أدوات خارجية</w:t>
+              <w:t>1) JPEG/BMP   2) PNG with no external tools</w:t>
             </w:r>
           </w:p>
         </w:tc>
@@ -2358,7 +2359,7 @@
                 <w:color w:val="1A1A1A"/>
                 <w:sz w:val="20"/>
               </w:rPr>
-              <w:t>الصوت</w:t>
+              <w:t>Audio</w:t>
             </w:r>
           </w:p>
         </w:tc>
@@ -2394,7 +2395,7 @@
                 <w:color w:val="1A1A1A"/>
                 <w:sz w:val="20"/>
               </w:rPr>
-              <w:t>1) السعة   2) الإخفاء السمعي   3) المقاومة   4) الحجم الكبير</w:t>
+              <w:t>1) capacity   2) aural stealth   3) robustness   4) large payload</w:t>
             </w:r>
           </w:p>
         </w:tc>
@@ -2414,7 +2415,7 @@
                 <w:color w:val="1A1A1A"/>
                 <w:sz w:val="20"/>
               </w:rPr>
-              <w:t>الفيديو</w:t>
+              <w:t>Video</w:t>
             </w:r>
           </w:p>
         </w:tc>
@@ -2450,7 +2451,7 @@
                 <w:color w:val="1A1A1A"/>
                 <w:sz w:val="20"/>
               </w:rPr>
-              <w:t>1) شفاف بصرياً   2) سعة   3) مقاومة</w:t>
+              <w:t>1) visually lossless   2) capacity   3) robustness</w:t>
             </w:r>
           </w:p>
         </w:tc>
@@ -2470,7 +2471,7 @@
                 <w:color w:val="1A1A1A"/>
                 <w:sz w:val="20"/>
               </w:rPr>
-              <w:t>الشبكة</w:t>
+              <w:t>Network</w:t>
             </w:r>
           </w:p>
         </w:tc>
@@ -2488,7 +2489,7 @@
                 <w:color w:val="1A1A1A"/>
                 <w:sz w:val="20"/>
               </w:rPr>
-              <w:t>1) IP-ID LSB   2) TCP ISN LSB   3) Timing Channel</w:t>
+              <w:t>1) IP-ID LSB   2) TCP ISN LSB   3) Timing channel</w:t>
             </w:r>
           </w:p>
         </w:tc>
@@ -2506,7 +2507,7 @@
                 <w:color w:val="1A1A1A"/>
                 <w:sz w:val="20"/>
               </w:rPr>
-              <w:t>قنوات خفية متعددة + كاشف مدمج</w:t>
+              <w:t>multiple covert channels + built-in detector</w:t>
             </w:r>
           </w:p>
         </w:tc>
@@ -2526,7 +2527,7 @@
                 <w:color w:val="1A1A1A"/>
                 <w:sz w:val="20"/>
               </w:rPr>
-              <w:t>البرامج الضارة</w:t>
+              <w:t>Malware</w:t>
             </w:r>
           </w:p>
         </w:tc>
@@ -2544,7 +2545,7 @@
                 <w:color w:val="1A1A1A"/>
                 <w:sz w:val="20"/>
               </w:rPr>
-              <w:t>كشف بصمات: PyInstaller · WinRAR/SFX · Sliver · Metasploit (msfvenom/meterpreter)</w:t>
+              <w:t>Fingerprints: PyInstaller · WinRAR/SFX · Sliver · Metasploit (msfvenom/meterpreter)</w:t>
             </w:r>
           </w:p>
         </w:tc>
@@ -2562,7 +2563,7 @@
                 <w:color w:val="1A1A1A"/>
                 <w:sz w:val="20"/>
               </w:rPr>
-              <w:t>تحليل دفاعي + إنتروبيا + Overlay</w:t>
+              <w:t>defensive analysis + entropy + overlay</w:t>
             </w:r>
           </w:p>
         </w:tc>
@@ -2582,7 +2583,7 @@
           <w:color w:val="008050"/>
           <w:sz w:val="36"/>
         </w:rPr>
-        <w:t>6) البنية المعمارية وهيكل المشروع</w:t>
+        <w:t>6) Architecture &amp; Project Structure</w:t>
       </w:r>
     </w:p>
     <w:tbl>
@@ -2611,7 +2612,7 @@
                 <w:color w:val="008050"/>
                 <w:sz w:val="20"/>
               </w:rPr>
-              <w:t>الطبقة</w:t>
+              <w:t>Layer</w:t>
             </w:r>
           </w:p>
         </w:tc>
@@ -2629,7 +2630,7 @@
                 <w:color w:val="008050"/>
                 <w:sz w:val="20"/>
               </w:rPr>
-              <w:t>المكونات</w:t>
+              <w:t>Components</w:t>
             </w:r>
           </w:p>
         </w:tc>
@@ -2649,7 +2650,7 @@
                 <w:color w:val="1A1A1A"/>
                 <w:sz w:val="20"/>
               </w:rPr>
-              <w:t>العرض</w:t>
+              <w:t>Presentation</w:t>
             </w:r>
           </w:p>
         </w:tc>
@@ -2667,7 +2668,7 @@
                 <w:color w:val="1A1A1A"/>
                 <w:sz w:val="20"/>
               </w:rPr>
-              <w:t>Dashboard (PySide6، 10 صفحات: Dashboard/Forensics/Hashing/Text/Image/Audio/Video/Network/Malware/Case) + CLI (argparse)</w:t>
+              <w:t>Dashboard (PySide6, 10 pages: Dashboard/Forensics/Hashing/Text/Image/Audio/Video/Network/Malware/Case) + CLI (argparse)</w:t>
             </w:r>
           </w:p>
         </w:tc>
@@ -2687,7 +2688,7 @@
                 <w:color w:val="1A1A1A"/>
                 <w:sz w:val="20"/>
               </w:rPr>
-              <w:t>القضايا</w:t>
+              <w:t>Case Layer</w:t>
             </w:r>
           </w:p>
         </w:tc>
@@ -2725,7 +2726,7 @@
                 <w:color w:val="1A1A1A"/>
                 <w:sz w:val="20"/>
               </w:rPr>
-              <w:t>الوحدات الأساسية</w:t>
+              <w:t>Core Modules</w:t>
             </w:r>
           </w:p>
         </w:tc>
@@ -2763,7 +2764,7 @@
                 <w:color w:val="1A1A1A"/>
                 <w:sz w:val="20"/>
               </w:rPr>
-              <w:t>أدوات Kali</w:t>
+              <w:t>Kali Tools</w:t>
             </w:r>
           </w:p>
         </w:tc>
@@ -2781,7 +2782,7 @@
                 <w:color w:val="1A1A1A"/>
                 <w:sz w:val="20"/>
               </w:rPr>
-              <w:t>steghide · exiftool · binwalk · foremost · zsteg · file · strings · ffmpeg/ffprobe (+ بدائل مدمجة)</w:t>
+              <w:t>steghide · exiftool · binwalk · foremost · zsteg · file · strings · ffmpeg/ffprobe (+ built-in fallbacks)</w:t>
             </w:r>
           </w:p>
         </w:tc>
@@ -2801,7 +2802,7 @@
                 <w:color w:val="1A1A1A"/>
                 <w:sz w:val="20"/>
               </w:rPr>
-              <w:t>الاختبارات</w:t>
+              <w:t>Tests</w:t>
             </w:r>
           </w:p>
         </w:tc>
@@ -2819,7 +2820,7 @@
                 <w:color w:val="1A1A1A"/>
                 <w:sz w:val="20"/>
               </w:rPr>
-              <w:t>tests/test_requirements.py (60 فحص حي) · tests/test_integration.py (24 حالة)</w:t>
+              <w:t>tests/test_requirements.py (60 live checks) · tests/test_integration.py (24 cases)</w:t>
             </w:r>
           </w:p>
         </w:tc>
@@ -2838,7 +2839,7 @@
           <w:color w:val="1A1A1A"/>
           <w:sz w:val="22"/>
         </w:rPr>
-        <w:t>قرار هندسي مهم: كل واجهة أداة خارجية تمرّ عبر «كاشف توفر» (shutil.which) — إن وجدت الأداة استُدعيت مباشرة، وإن غابت انتقل النظام إلى التنفيذ الخالص بـ Python دون أي رسالة خطأ تعطّل العمل.</w:t>
+        <w:t>Important engineering decision: every external-tool wrapper passes through an availability probe (shutil.which). If the tool exists it is invoked directly; if missing, the system switches to a pure-Python implementation instantly — no user-facing failure, no broken workflow.</w:t>
       </w:r>
     </w:p>
     <w:p>
@@ -2854,7 +2855,7 @@
           <w:color w:val="008050"/>
           <w:sz w:val="36"/>
         </w:rPr>
-        <w:t>7) الاختبار والتحقق من الجودة</w:t>
+        <w:t>7) Testing &amp; Quality Verification</w:t>
       </w:r>
     </w:p>
     <w:tbl>
@@ -2884,7 +2885,7 @@
                 <w:color w:val="008050"/>
                 <w:sz w:val="20"/>
               </w:rPr>
-              <w:t>الاختبار</w:t>
+              <w:t>Test</w:t>
             </w:r>
           </w:p>
         </w:tc>
@@ -2902,7 +2903,7 @@
                 <w:color w:val="008050"/>
                 <w:sz w:val="20"/>
               </w:rPr>
-              <w:t>النتيجة</w:t>
+              <w:t>Result</w:t>
             </w:r>
           </w:p>
         </w:tc>
@@ -2920,7 +2921,7 @@
                 <w:color w:val="008050"/>
                 <w:sz w:val="20"/>
               </w:rPr>
-              <w:t>المدى</w:t>
+              <w:t>Scope</w:t>
             </w:r>
           </w:p>
         </w:tc>
@@ -2940,7 +2941,7 @@
                 <w:color w:val="1A1A1A"/>
                 <w:sz w:val="20"/>
               </w:rPr>
-              <w:t>مصفوفة المتطلبات (فحوصات حية تلقائية)</w:t>
+              <w:t>Requirements matrix (self-running live checks)</w:t>
             </w:r>
           </w:p>
         </w:tc>
@@ -2976,7 +2977,7 @@
                 <w:color w:val="1A1A1A"/>
                 <w:sz w:val="20"/>
               </w:rPr>
-              <w:t>كل بند من ملف المتطلبات له فحص يتحقق فعلياً من التنفيذ</w:t>
+              <w:t>every requirement item has a check that actually exercises the implementation</w:t>
             </w:r>
           </w:p>
         </w:tc>
@@ -2996,7 +2997,7 @@
                 <w:color w:val="1A1A1A"/>
                 <w:sz w:val="20"/>
               </w:rPr>
-              <w:t>اختبارات التكامل الشاملة</w:t>
+              <w:t>End-to-end integration suite</w:t>
             </w:r>
           </w:p>
         </w:tc>
@@ -3032,7 +3033,7 @@
                 <w:color w:val="1A1A1A"/>
                 <w:sz w:val="20"/>
               </w:rPr>
-              <w:t>نص (تقنيتان) · صورة · صوت (4) · فيديو حقيقي عبر ffmpeg · شبكة · برامج ضارة · Forensics · هاش · قضايا · Metadata</w:t>
+              <w:t>text (2 techniques) · image · audio (4) · real video via ffmpeg · network · malware · forensics · hashing · cases · metadata</w:t>
             </w:r>
           </w:p>
         </w:tc>
@@ -3052,7 +3053,7 @@
                 <w:color w:val="1A1A1A"/>
                 <w:sz w:val="20"/>
               </w:rPr>
-              <w:t>أدوات Kali الحقيقية</w:t>
+              <w:t>Real Kali toolchain</w:t>
             </w:r>
           </w:p>
         </w:tc>
@@ -3108,7 +3109,7 @@
                 <w:color w:val="1A1A1A"/>
                 <w:sz w:val="20"/>
               </w:rPr>
-              <w:t>جولات إخفاء/استخراج كاملة</w:t>
+              <w:t>Full hide/extract rounds</w:t>
             </w:r>
           </w:p>
         </w:tc>
@@ -3126,7 +3127,7 @@
                 <w:color w:val="1A1A1A"/>
                 <w:sz w:val="20"/>
               </w:rPr>
-              <w:t>كلها ✓</w:t>
+              <w:t>all ✓</w:t>
             </w:r>
           </w:p>
         </w:tc>
@@ -3144,7 +3145,7 @@
                 <w:color w:val="1A1A1A"/>
                 <w:sz w:val="20"/>
               </w:rPr>
-              <w:t>بما فيها steghide حقيقي (إخفاء + info + استخراج + رفض مفتاح خاطئ)</w:t>
+              <w:t>including real steghide (embed + info + extract + wrong-passphrase rejection)</w:t>
             </w:r>
           </w:p>
         </w:tc>
@@ -3164,7 +3165,7 @@
                 <w:color w:val="1A1A1A"/>
                 <w:sz w:val="20"/>
               </w:rPr>
-              <w:t>الواجهة الرسومية</w:t>
+              <w:t>Graphical interface</w:t>
             </w:r>
           </w:p>
         </w:tc>
@@ -3182,7 +3183,7 @@
                 <w:color w:val="1A1A1A"/>
                 <w:sz w:val="20"/>
               </w:rPr>
-              <w:t>10 صفحات ✓</w:t>
+              <w:t>10 pages ✓</w:t>
             </w:r>
           </w:p>
         </w:tc>
@@ -3200,7 +3201,7 @@
                 <w:color w:val="1A1A1A"/>
                 <w:sz w:val="20"/>
               </w:rPr>
-              <w:t>فحص headless لكل صفحة + تبويبات العمل</w:t>
+              <w:t>headless smoke test of every page and workflow tab</w:t>
             </w:r>
           </w:p>
         </w:tc>
@@ -3220,7 +3221,7 @@
           <w:color w:val="008050"/>
           <w:sz w:val="36"/>
         </w:rPr>
-        <w:t>7.1 مصداقية التحليل الجنائي (نتائج حقيقية موثّقة)</w:t>
+        <w:t>7.1 Forensic honesty (real, recorded results)</w:t>
       </w:r>
     </w:p>
     <w:tbl>
@@ -3249,7 +3250,7 @@
                 <w:color w:val="008050"/>
                 <w:sz w:val="20"/>
               </w:rPr>
-              <w:t>الحالة</w:t>
+              <w:t>Scenario</w:t>
             </w:r>
           </w:p>
         </w:tc>
@@ -3267,7 +3268,7 @@
                 <w:color w:val="008050"/>
                 <w:sz w:val="20"/>
               </w:rPr>
-              <w:t>النتيجة الفعلية للأداة</w:t>
+              <w:t>Actual tool output</w:t>
             </w:r>
           </w:p>
         </w:tc>
@@ -3287,7 +3288,7 @@
                 <w:color w:val="1A1A1A"/>
                 <w:sz w:val="20"/>
               </w:rPr>
-              <w:t>صورة نظيفة (بلا إخفاء)</w:t>
+              <w:t>Clean image (no hidden data)</w:t>
             </w:r>
           </w:p>
         </w:tc>
@@ -3305,7 +3306,7 @@
                 <w:color w:val="1A1A1A"/>
                 <w:sz w:val="20"/>
               </w:rPr>
-              <w:t>لا توجد مؤشرات إخفاء قوية (clean verdict)</w:t>
+              <w:t>No strong hiding indicators found (clean verdict)</w:t>
             </w:r>
           </w:p>
         </w:tc>
@@ -3325,7 +3326,7 @@
                 <w:color w:val="1A1A1A"/>
                 <w:sz w:val="20"/>
               </w:rPr>
-              <w:t>صورة Steghide حقيقية + كلمة مرور صحيحة</w:t>
+              <w:t>Real steghide JPEG + correct passphrase</w:t>
             </w:r>
           </w:p>
         </w:tc>
@@ -3343,7 +3344,7 @@
                 <w:color w:val="1A1A1A"/>
                 <w:sz w:val="20"/>
               </w:rPr>
-              <w:t>SUSPICIOUS: steghide payload مع تفاصيل (الحجم/اسم الملف/التشفير)</w:t>
+              <w:t>SUSPICIOUS: steghide payload with details (size / embedded name / encryption)</w:t>
             </w:r>
           </w:p>
         </w:tc>
@@ -3363,7 +3364,7 @@
                 <w:color w:val="1A1A1A"/>
                 <w:sz w:val="20"/>
               </w:rPr>
-              <w:t>نص بحروف Zero-Width</w:t>
+              <w:t>Zero-Width text payload</w:t>
             </w:r>
           </w:p>
         </w:tc>
@@ -3381,7 +3382,7 @@
                 <w:color w:val="1A1A1A"/>
                 <w:sz w:val="20"/>
               </w:rPr>
-              <w:t>text-inspect: SUSPICIOUS — حمولة مكتشفة بدون المفتاح</w:t>
+              <w:t>text-inspect: SUSPICIOUS — payload detected without the key</w:t>
             </w:r>
           </w:p>
         </w:tc>
@@ -3401,7 +3402,7 @@
                 <w:color w:val="1A1A1A"/>
                 <w:sz w:val="20"/>
               </w:rPr>
-              <w:t>ملف مضغوط أو حاوية</w:t>
+              <w:t>Compressed containers</w:t>
             </w:r>
           </w:p>
         </w:tc>
@@ -3419,7 +3420,7 @@
                 <w:color w:val="1A1A1A"/>
                 <w:sz w:val="20"/>
               </w:rPr>
-              <w:t>ملاحظات إنتروبيا مضبوطة لتجنّب الإنذارات الكاذبة</w:t>
+              <w:t>entropy notes are tuned to avoid false positives</w:t>
             </w:r>
           </w:p>
         </w:tc>
@@ -3439,7 +3440,7 @@
           <w:color w:val="008050"/>
           <w:sz w:val="36"/>
         </w:rPr>
-        <w:t>8) نسبة المطابقة مع ملف المتطلبات</w:t>
+        <w:t>8) Compliance with the Project Specification</w:t>
       </w:r>
     </w:p>
     <w:p>
@@ -3454,7 +3455,7 @@
           <w:color w:val="1A1A1A"/>
           <w:sz w:val="22"/>
         </w:rPr>
-        <w:t>نسبة المطابقة الإجمالية مع ملف المشروع: ≈ 99.8% — لا يوجد قسم متطلبات ناقص. بندان قُيّما 95% لقرارات هندسية موثّقة:</w:t>
+        <w:t>Overall compliance with the project file: ≈ 99.8% — no requirements section is missing. Two items were rated 95% due to documented engineering choices:</w:t>
       </w:r>
     </w:p>
     <w:p>
@@ -3470,7 +3471,7 @@
           <w:color w:val="1A1A1A"/>
           <w:sz w:val="22"/>
         </w:rPr>
-        <w:t>• مخرجات تركيب الطيف (Spectrogram/Waveform) تُنتَج بأسلوب Audacity من داخل الأداة عبر FFmpeg + التحليل المدمج (الناتج معادل وظيفياً).</w:t>
+        <w:t>• Spectrogram/Waveform outputs are produced Audacity-style from inside the tool via FFmpeg + built-in analysis (functionally equivalent output).</w:t>
       </w:r>
     </w:p>
     <w:p>
@@ -3486,7 +3487,7 @@
           <w:color w:val="1A1A1A"/>
           <w:sz w:val="22"/>
         </w:rPr>
-        <w:t>• Video LSB تُنفَّذ عبر المسار الصوتي مع نسخ الإطارات البصرية (-c:v copy) لضمان عدم تلف البتات — الترميز المفقود (AAC) يدمّر الإخفاء.</w:t>
+        <w:t>• Video LSB is implemented through the audio track while copying the visual frames (-c:v copy) to guarantee bit integrity — lossy codecs (AAC) destroy hidden bits.</w:t>
       </w:r>
     </w:p>
     <w:p>
@@ -3502,7 +3503,7 @@
           <w:color w:val="008050"/>
           <w:sz w:val="36"/>
         </w:rPr>
-        <w:t>9) معرض لقطات الواجهة (GUI)</w:t>
+        <w:t>9) GUI Screenshots Gallery</w:t>
       </w:r>
     </w:p>
     <w:p>
@@ -3557,7 +3558,7 @@
           <w:color w:val="606060"/>
           <w:sz w:val="20"/>
         </w:rPr>
-        <w:t>لوحة التحكم الرئيسية — تختار نوع الإخفاء أو تنتقل للتحليل الجنائي</w:t>
+        <w:t>Main Dashboard — choose a hiding type or jump to Forensics / Analysis</w:t>
       </w:r>
     </w:p>
     <w:p>
@@ -3612,7 +3613,7 @@
           <w:color w:val="606060"/>
           <w:sz w:val="20"/>
         </w:rPr>
-        <w:t>التحليل الجنائي: 8 أدوات في تقرير واحد + Verdict</w:t>
+        <w:t>Forensics: 8 tools in one report + verdict</w:t>
       </w:r>
     </w:p>
     <w:p>
@@ -3667,7 +3668,7 @@
           <w:color w:val="606060"/>
           <w:sz w:val="20"/>
         </w:rPr>
-        <w:t>الهاش والسلامة: MD5 / SHA-1 / SHA-256 / SHA-512</w:t>
+        <w:t>Hashing &amp; integrity: MD5 / SHA-1 / SHA-256 / SHA-512</w:t>
       </w:r>
     </w:p>
     <w:p>
@@ -3722,7 +3723,7 @@
           <w:color w:val="606060"/>
           <w:sz w:val="20"/>
         </w:rPr>
-        <w:t>أداة البيانات الوصفية — العرض والحقن (المتطلب 1)</w:t>
+        <w:t>Metadata tool — View &amp; Inject (requirement item 1)</w:t>
       </w:r>
     </w:p>
     <w:p>
@@ -3777,7 +3778,7 @@
           <w:color w:val="606060"/>
           <w:sz w:val="20"/>
         </w:rPr>
-        <w:t>إخفاء الصوت بأربع تقنيات (LSB / Phase / SS / Metadata)</w:t>
+        <w:t>Audio hiding with four techniques (LSB / Phase / SS / Metadata)</w:t>
       </w:r>
     </w:p>
     <w:p>
@@ -3832,7 +3833,7 @@
           <w:color w:val="606060"/>
           <w:sz w:val="20"/>
         </w:rPr>
-        <w:t>إخفاء الفيديو (VideoHide + FFmpeg/FFprobe)</w:t>
+        <w:t>Video hiding (VideoHide + FFmpeg/FFprobe)</w:t>
       </w:r>
     </w:p>
     <w:p>
@@ -3887,7 +3888,7 @@
           <w:color w:val="606060"/>
           <w:sz w:val="20"/>
         </w:rPr>
-        <w:t>قنوات الشبكة الخفية: IP-ID / ISN / Timing + الكشف</w:t>
+        <w:t>Network covert channels: IP-ID / ISN / Timing + detection</w:t>
       </w:r>
     </w:p>
     <w:p>
@@ -3942,7 +3943,7 @@
           <w:color w:val="606060"/>
           <w:sz w:val="20"/>
         </w:rPr>
-        <w:t>مختبر البرامج الضارة: PE/ELF + إنتروبيا + بصمات الأطر</w:t>
+        <w:t>Malware lab: PE/ELF + entropy + framework fingerprints</w:t>
       </w:r>
     </w:p>
     <w:p>
@@ -3997,7 +3998,7 @@
           <w:color w:val="606060"/>
           <w:sz w:val="20"/>
         </w:rPr>
-        <w:t>إدارة القضايا والتقارير والسجلات</w:t>
+        <w:t>Case management, reports and logs</w:t>
       </w:r>
     </w:p>
     <w:p>
@@ -4052,7 +4053,7 @@
           <w:color w:val="606060"/>
           <w:sz w:val="20"/>
         </w:rPr>
-        <w:t>الواجهة النصية CLI — 22 أمراً</w:t>
+        <w:t>Command-line interface — 22 commands</w:t>
       </w:r>
     </w:p>
     <w:p>
@@ -4068,7 +4069,7 @@
           <w:color w:val="008050"/>
           <w:sz w:val="36"/>
         </w:rPr>
-        <w:t>10) أمثلة الاستخدام</w:t>
+        <w:t>10) Usage Examples</w:t>
       </w:r>
     </w:p>
     <w:p>
@@ -4263,7 +4264,7 @@
           <w:color w:val="1A1A1A"/>
           <w:sz w:val="21"/>
         </w:rPr>
-        <w:t>› python demo.py   # عرض شامل (29 ملفاً تجريبياً)</w:t>
+        <w:t>› python demo.py   # full demonstration (29 demo artifacts)</w:t>
       </w:r>
     </w:p>
     <w:p>
@@ -4279,7 +4280,7 @@
           <w:color w:val="008050"/>
           <w:sz w:val="36"/>
         </w:rPr>
-        <w:t>11) الحماية والأخلاقيات المدمجة</w:t>
+        <w:t>11) Built-in Security &amp; Ethics</w:t>
       </w:r>
     </w:p>
     <w:p>
@@ -4295,7 +4296,7 @@
           <w:color w:val="1A1A1A"/>
           <w:sz w:val="22"/>
         </w:rPr>
-        <w:t>• كل تقنيات الإخفاء محمية بمفتاح/كلمة مرور (PBKDF2-HMAC-SHA256 + تشفير في أغلبها) ورفض صريح للمفتاح الخاطئ.</w:t>
+        <w:t>• Every hiding technique is protected by a key/passphrase (PBKDF2-HMAC-SHA256 + encryption in most) and explicitly rejects wrong keys.</w:t>
       </w:r>
     </w:p>
     <w:p>
@@ -4311,7 +4312,7 @@
           <w:color w:val="1A1A1A"/>
           <w:sz w:val="22"/>
         </w:rPr>
-        <w:t>• حقن البيانات الوصفية لا يلمس الملف الأصلي أبداً (exiftool -o → ملف جديد).</w:t>
+        <w:t>• Metadata injection never touches the original file (exiftool -o → new file).</w:t>
       </w:r>
     </w:p>
     <w:p>
@@ -4327,7 +4328,7 @@
           <w:color w:val="1A1A1A"/>
           <w:sz w:val="22"/>
         </w:rPr>
-        <w:t>• وحدة البرامج الضارة دفاعية بالكامل: تحليل وكشف فقط ونماذج تعليمية خاملة — لا توليد أدوات ضارة.</w:t>
+        <w:t>• The malware module is fully defensive: analysis and detection only, with inert educational stubs — no malicious tool generation.</w:t>
       </w:r>
     </w:p>
     <w:p>
@@ -4343,7 +4344,7 @@
           <w:color w:val="1A1A1A"/>
           <w:sz w:val="22"/>
         </w:rPr>
-        <w:t>• كشف الإخفاء (Forensics) مضبوط ضد الإنذارات الكاذبة (إخفاء الإنتروبيا العالية في الحاويات المضغوطة).</w:t>
+        <w:t>• Detection is tuned against false positives (high-entropy compressed containers are reported as notes, not verdicts).</w:t>
       </w:r>
     </w:p>
     <w:p>
@@ -4359,7 +4360,7 @@
           <w:color w:val="1A1A1A"/>
           <w:sz w:val="22"/>
         </w:rPr>
-        <w:t>• المخرجات تُوثَّق في سجل التحقيقات (logs/investigation.log) لأغراض المساءلة الأكاديمية.</w:t>
+        <w:t>• Every operation is written to the investigation log (logs/investigation.log) for academic accountability.</w:t>
       </w:r>
     </w:p>
     <w:p>
@@ -4375,7 +4376,7 @@
           <w:color w:val="008050"/>
           <w:sz w:val="36"/>
         </w:rPr>
-        <w:t>12) مخرجات المشروع والتسليمات</w:t>
+        <w:t>12) Project Deliverables</w:t>
       </w:r>
     </w:p>
     <w:tbl>
@@ -4404,7 +4405,7 @@
                 <w:color w:val="008050"/>
                 <w:sz w:val="20"/>
               </w:rPr>
-              <w:t>المخرج</w:t>
+              <w:t>Deliverable</w:t>
             </w:r>
           </w:p>
         </w:tc>
@@ -4422,7 +4423,7 @@
                 <w:color w:val="008050"/>
                 <w:sz w:val="20"/>
               </w:rPr>
-              <w:t>الملف</w:t>
+              <w:t>File</w:t>
             </w:r>
           </w:p>
         </w:tc>
@@ -4442,7 +4443,7 @@
                 <w:color w:val="1A1A1A"/>
                 <w:sz w:val="20"/>
               </w:rPr>
-              <w:t>الأداة الكاملة (كود المصدر)</w:t>
+              <w:t>Complete tool (source)</w:t>
             </w:r>
           </w:p>
         </w:tc>
@@ -4460,7 +4461,7 @@
                 <w:color w:val="1A1A1A"/>
                 <w:sz w:val="20"/>
               </w:rPr>
-              <w:t>StegoNexus/ (وحدات core + GUI + CLI + case)</w:t>
+              <w:t>StegoNexus/ (core modules + GUI + CLI + case)</w:t>
             </w:r>
           </w:p>
         </w:tc>
@@ -4480,7 +4481,7 @@
                 <w:color w:val="1A1A1A"/>
                 <w:sz w:val="20"/>
               </w:rPr>
-              <w:t>البرزنتيشن</w:t>
+              <w:t>Presentation</w:t>
             </w:r>
           </w:p>
         </w:tc>
@@ -4498,7 +4499,7 @@
                 <w:color w:val="1A1A1A"/>
                 <w:sz w:val="20"/>
               </w:rPr>
-              <w:t>StegoNexus_Presentation.pptx — 17 شريحة</w:t>
+              <w:t>StegoNexus_Presentation.pptx — 17 slides</w:t>
             </w:r>
           </w:p>
         </w:tc>
@@ -4518,7 +4519,7 @@
                 <w:color w:val="1A1A1A"/>
                 <w:sz w:val="20"/>
               </w:rPr>
-              <w:t>وثيقة التوثيق الرسمية</w:t>
+              <w:t>Official documentation</w:t>
             </w:r>
           </w:p>
         </w:tc>
@@ -4536,7 +4537,7 @@
                 <w:color w:val="1A1A1A"/>
                 <w:sz w:val="20"/>
               </w:rPr>
-              <w:t>StegoNexus_Documentation.docx</w:t>
+              <w:t>StegoNexus_Documentation.docx (Arabic)</w:t>
             </w:r>
           </w:p>
         </w:tc>
@@ -4556,7 +4557,7 @@
                 <w:color w:val="1A1A1A"/>
                 <w:sz w:val="20"/>
               </w:rPr>
-              <w:t>التقرير الاحترافي</w:t>
+              <w:t>Professional report</w:t>
             </w:r>
           </w:p>
         </w:tc>
@@ -4574,7 +4575,7 @@
                 <w:color w:val="1A1A1A"/>
                 <w:sz w:val="20"/>
               </w:rPr>
-              <w:t>StegoNexus_Professional_Report.docx (هذا الملف)</w:t>
+              <w:t>StegoNexus_Professional_Report_EN.docx (this file) · AR version kept too</w:t>
             </w:r>
           </w:p>
         </w:tc>
@@ -4594,7 +4595,7 @@
                 <w:color w:val="1A1A1A"/>
                 <w:sz w:val="20"/>
               </w:rPr>
-              <w:t>أسئلة المناقشة وإجاباتها</w:t>
+              <w:t>Viva questions &amp; model answers</w:t>
             </w:r>
           </w:p>
         </w:tc>
@@ -4632,7 +4633,7 @@
                 <w:color w:val="1A1A1A"/>
                 <w:sz w:val="20"/>
               </w:rPr>
-              <w:t>تقرير الاختبار</w:t>
+              <w:t>Test report</w:t>
             </w:r>
           </w:p>
         </w:tc>
@@ -4670,7 +4671,7 @@
                 <w:color w:val="1A1A1A"/>
                 <w:sz w:val="20"/>
               </w:rPr>
-              <w:t>تقرير المطابقة مع المتطلبات</w:t>
+              <w:t>Spec compliance report</w:t>
             </w:r>
           </w:p>
         </w:tc>
@@ -4708,7 +4709,7 @@
                 <w:color w:val="1A1A1A"/>
                 <w:sz w:val="20"/>
               </w:rPr>
-              <w:t>دليل التشغيل على Kali</w:t>
+              <w:t>Kali run guide</w:t>
             </w:r>
           </w:p>
         </w:tc>
@@ -4746,7 +4747,7 @@
                 <w:color w:val="1A1A1A"/>
                 <w:sz w:val="20"/>
               </w:rPr>
-              <w:t>معرض اللقطات + الشعار</w:t>
+              <w:t>Screenshot suite + brand logo</w:t>
             </w:r>
           </w:p>
         </w:tc>
@@ -4764,7 +4765,7 @@
                 <w:color w:val="1A1A1A"/>
                 <w:sz w:val="20"/>
               </w:rPr>
-              <w:t>screenshots/ (10 صفحات GUI + 11 لقطة CLI + التصميمات)</w:t>
+              <w:t>screenshots/ (10 GUI pages + 11 CLI shots + logos)</w:t>
             </w:r>
           </w:p>
         </w:tc>
@@ -4784,7 +4785,7 @@
                 <w:color w:val="1A1A1A"/>
                 <w:sz w:val="20"/>
               </w:rPr>
-              <w:t>عرض عملي كامل</w:t>
+              <w:t>Full working demo</w:t>
             </w:r>
           </w:p>
         </w:tc>
@@ -4802,7 +4803,7 @@
                 <w:color w:val="1A1A1A"/>
                 <w:sz w:val="20"/>
               </w:rPr>
-              <w:t>demo.py → demo_output/ (29 ملفاً)</w:t>
+              <w:t>demo.py → demo_output/ (29 artifacts)</w:t>
             </w:r>
           </w:p>
         </w:tc>
@@ -4822,7 +4823,7 @@
           <w:color w:val="008050"/>
           <w:sz w:val="36"/>
         </w:rPr>
-        <w:t>13) الخلاصة</w:t>
+        <w:t>13) Conclusion</w:t>
       </w:r>
     </w:p>
     <w:p>
@@ -4837,7 +4838,7 @@
           <w:color w:val="1A1A1A"/>
           <w:sz w:val="22"/>
         </w:rPr>
-        <w:t>StegoNexus أداة واحدة تجمع كل ما أُخذ في الترم: الإخفاء والاستخراج في النصوص (بتقنيتين)، الصور (Steghide + CyberHide)، الصوت (4 تقنيات)، الفيديو (3 تقنيات)، والشبكة (3 قنوات)، مع قسم تحليل جنائي كامل وهاش وإدارة قضايا وتقارير وسجلات — وكلها بقدرة على العمل حتى بدون أدوات Kali الخارجية. اجتازت الأداة 60/60 فحص متطلبات حي و24/24 اختبار تكامل، ومطابقتها لملف المشروع ≈ 99.8%، وهي جاهزة للعرض والمناقشة والتقييم.</w:t>
+        <w:t>StegoNexus is one tool that brings together everything covered in the term: hiding and extraction in text (2 techniques), images (Steghide + CyberHide), audio (4 techniques), video (3 techniques) and network (3 channels), plus a complete forensics section, hashing, and case management with reports and logs — all of it able to run even without any external Kali tool. The tool passed 60/60 live requirement checks and 24/24 integration tests, matches the project file at ≈99.8%, and is ready for demonstration and assessment.</w:t>
       </w:r>
     </w:p>
     <w:sectPr>

</xml_diff>